<commit_message>
Remove GitHub profile link from online and downloadable CV
</commit_message>
<xml_diff>
--- a/assets/Hrvoje_Jerkovic_CV_EN.docx
+++ b/assets/Hrvoje_Jerkovic_CV_EN.docx
@@ -57,18 +57,6 @@
             <w:u w:val="none"/>
           </w:rPr>
           <w:t>LinkedIn</w:t>
-        </w:r>
-      </w:hyperlink>
-      <w:r>
-        <w:t xml:space="preserve"> | </w:t>
-      </w:r>
-      <w:hyperlink r:id="rId11">
-        <w:r>
-          <w:rPr>
-            <w:color w:val="173D59"/>
-            <w:u w:val="none"/>
-          </w:rPr>
-          <w:t>GitHub</w:t>
         </w:r>
       </w:hyperlink>
     </w:p>
@@ -189,7 +177,7 @@
       <w:r>
         <w:t xml:space="preserve">Raiffeisenbank Austria d.d., Croatia (RBA) | Sep 2025 - Feb 2026 | </w:t>
       </w:r>
-      <w:hyperlink r:id="rId12">
+      <w:hyperlink r:id="rId11">
         <w:r>
           <w:rPr>
             <w:color w:val="173D59"/>
@@ -271,7 +259,7 @@
           <w:numId w:val="10"/>
         </w:numPr>
       </w:pPr>
-      <w:hyperlink r:id="rId13">
+      <w:hyperlink r:id="rId12">
         <w:r>
           <w:rPr>
             <w:color w:val="173D59"/>
@@ -295,7 +283,7 @@
       <w:r>
         <w:t xml:space="preserve">Designed and implemented a </w:t>
       </w:r>
-      <w:hyperlink r:id="rId14">
+      <w:hyperlink r:id="rId13">
         <w:r>
           <w:rPr>
             <w:color w:val="173D59"/>
@@ -316,7 +304,7 @@
           <w:numId w:val="10"/>
         </w:numPr>
       </w:pPr>
-      <w:hyperlink r:id="rId15">
+      <w:hyperlink r:id="rId14">
         <w:r>
           <w:rPr>
             <w:color w:val="173D59"/>
@@ -328,7 +316,7 @@
       <w:r>
         <w:t xml:space="preserve">: led data modelling and integration of marketing sources using Snowflake, dbt and Matillion. Built </w:t>
       </w:r>
-      <w:hyperlink r:id="rId16">
+      <w:hyperlink r:id="rId15">
         <w:r>
           <w:rPr>
             <w:color w:val="173D59"/>
@@ -349,7 +337,7 @@
           <w:numId w:val="10"/>
         </w:numPr>
       </w:pPr>
-      <w:hyperlink r:id="rId17">
+      <w:hyperlink r:id="rId16">
         <w:r>
           <w:rPr>
             <w:color w:val="173D59"/>
@@ -361,7 +349,7 @@
       <w:r>
         <w:t xml:space="preserve">: developed a metadata extraction solution using Python, PostgreSQL and Collibra, and a separate tested </w:t>
       </w:r>
-      <w:hyperlink r:id="rId18">
+      <w:hyperlink r:id="rId17">
         <w:r>
           <w:rPr>
             <w:color w:val="173D59"/>
@@ -373,7 +361,7 @@
       <w:r>
         <w:t xml:space="preserve"> for metadata and database-change capture. </w:t>
       </w:r>
-      <w:hyperlink r:id="rId19">
+      <w:hyperlink r:id="rId18">
         <w:r>
           <w:rPr>
             <w:color w:val="173D59"/>
@@ -408,7 +396,7 @@
       <w:pPr>
         <w:pStyle w:val="CVMetadata"/>
       </w:pPr>
-      <w:hyperlink r:id="rId20">
+      <w:hyperlink r:id="rId19">
         <w:r>
           <w:rPr>
             <w:color w:val="173D59"/>
@@ -457,7 +445,7 @@
       <w:pPr>
         <w:pStyle w:val="CVMetadata"/>
       </w:pPr>
-      <w:hyperlink r:id="rId21">
+      <w:hyperlink r:id="rId20">
         <w:r>
           <w:rPr>
             <w:color w:val="173D59"/>
@@ -506,7 +494,7 @@
       <w:pPr>
         <w:pStyle w:val="CVMetadata"/>
       </w:pPr>
-      <w:hyperlink r:id="rId22">
+      <w:hyperlink r:id="rId21">
         <w:r>
           <w:rPr>
             <w:color w:val="173D59"/>
@@ -555,7 +543,7 @@
       <w:pPr>
         <w:pStyle w:val="CVMetadata"/>
       </w:pPr>
-      <w:hyperlink r:id="rId23">
+      <w:hyperlink r:id="rId22">
         <w:r>
           <w:rPr>
             <w:color w:val="173D59"/>
@@ -604,7 +592,7 @@
           <w:numId w:val="10"/>
         </w:numPr>
       </w:pPr>
-      <w:hyperlink r:id="rId24">
+      <w:hyperlink r:id="rId23">
         <w:r>
           <w:rPr>
             <w:color w:val="173D59"/>
@@ -628,7 +616,7 @@
       <w:r>
         <w:t xml:space="preserve">Delivered data engineering, analytics and applied ML work across research and public-sector projects; developed computer-vision demonstrations and educational material for the </w:t>
       </w:r>
-      <w:hyperlink r:id="rId25">
+      <w:hyperlink r:id="rId24">
         <w:r>
           <w:rPr>
             <w:color w:val="173D59"/>
@@ -648,7 +636,7 @@
       <w:r>
         <w:t xml:space="preserve">Earlier experience: </w:t>
       </w:r>
-      <w:hyperlink r:id="rId26">
+      <w:hyperlink r:id="rId25">
         <w:r>
           <w:rPr>
             <w:color w:val="173D59"/>
@@ -713,7 +701,7 @@
       <w:pPr>
         <w:pStyle w:val="CVEducation"/>
       </w:pPr>
-      <w:hyperlink r:id="rId27">
+      <w:hyperlink r:id="rId26">
         <w:r>
           <w:rPr>
             <w:color w:val="173D59"/>
@@ -724,7 +712,7 @@
       </w:hyperlink>
     </w:p>
     <w:sectPr>
-      <w:footerReference w:type="default" r:id="rId28"/>
+      <w:footerReference w:type="default" r:id="rId27"/>
       <w:pgSz w:w="11906" w:h="16838"/>
       <w:pgMar w:top="1020" w:right="1020" w:bottom="1020" w:left="1020" w:header="510" w:footer="510" w:gutter="0"/>
       <w:cols w:space="720"/>

</xml_diff>

<commit_message>
Describe phasor comparison and PLC regulation; clarify project contributions
</commit_message>
<xml_diff>
--- a/assets/Hrvoje_Jerkovic_CV_EN.docx
+++ b/assets/Hrvoje_Jerkovic_CV_EN.docx
@@ -220,7 +220,7 @@
         </w:numPr>
       </w:pPr>
       <w:r>
-        <w:t>Built orchestration with nine specialised AI agents to translate legacy logic into dbt SQL. Added dependency ordering, SQL compilation/execution, checks against production reference outputs and failure escalation.</w:t>
+        <w:t>Built orchestration with nine specialised AI agents to translate legacy logic into dbt SQL. Ordered models by their dependencies, compiled and ran the SQL, compared results with production data and escalated failed checks.</w:t>
       </w:r>
     </w:p>
     <w:p>
@@ -232,7 +232,7 @@
         </w:numPr>
       </w:pPr>
       <w:r>
-        <w:t>Simplified the migration pattern by removing a separate materialised data-quality layer, eliminating approximately 340 materialisations. Handed over reusable models and pipelines to the delivery team.</w:t>
+        <w:t>Removed the need for approximately 340 separately stored data-quality tables by running quality checks within the new processing flow. Handed over reusable models and pipelines to the delivery team.</w:t>
       </w:r>
     </w:p>
     <w:p>
@@ -430,7 +430,7 @@
         </w:numPr>
       </w:pPr>
       <w:r>
-        <w:t>Coordinated technical delivery and stakeholder decisions; led UAT planning, integration validation and requirements-to-test traceability. Defined API contracts, error handling, retry/idempotency rules and acceptance criteria.</w:t>
+        <w:t>Coordinated technical delivery and stakeholder decisions. Led user acceptance testing and integration checks, linked requirements to test cases, and defined API behaviour, error handling, retries and rules to prevent duplicate processing.</w:t>
       </w:r>
     </w:p>
     <w:p>
@@ -602,7 +602,7 @@
         </w:r>
       </w:hyperlink>
       <w:r>
-        <w:t>: developed PMU ingestion, Avro schemas, Kafka/Java Streams synchronisation and rules, PostgreSQL integration and a reactive PLC interface; achieved approximately 50 ms processing-to-result latency.</w:t>
+        <w:t>: developed real-time software to compare phasor angles from PMU measurements, perform power-system calculations and trigger PLC actions for grid regulation. Used Python, Java and Kafka Streams; achieved a response below 50 ms, significantly faster than SCADA in this project.</w:t>
       </w:r>
     </w:p>
     <w:p>

</xml_diff>

<commit_message>
Expand portfolio with project details, research and graduate teaching
</commit_message>
<xml_diff>
--- a/assets/Hrvoje_Jerkovic_CV_EN.docx
+++ b/assets/Hrvoje_Jerkovic_CV_EN.docx
@@ -133,7 +133,25 @@
         <w:t xml:space="preserve">Cloud and delivery: </w:t>
       </w:r>
       <w:r>
-        <w:t>AWS production projects; GCP metadata/CDC prototyping; Azure Databricks workshop and lab development; Docker, Git and CI/CD practices.</w:t>
+        <w:t>AWS, Google Cloud (GCP), Microsoft Azure, Databricks, DigitalOcean, Oracle Cloud, Docker, Git and CI/CD.</w:t>
+      </w:r>
+    </w:p>
+    <w:p>
+      <w:pPr>
+        <w:pStyle w:val="CVBullet"/>
+        <w:numPr>
+          <w:ilvl w:val="0"/>
+          <w:numId w:val="10"/>
+        </w:numPr>
+      </w:pPr>
+      <w:r>
+        <w:rPr>
+          <w:b/>
+        </w:rPr>
+        <w:t xml:space="preserve">Analytics and marketing: </w:t>
+      </w:r>
+      <w:r>
+        <w:t>Google Analytics, e-marketing, cross-channel data integration, Tableau, Power BI and DAX.</w:t>
       </w:r>
     </w:p>
     <w:p>
@@ -238,6 +256,8 @@
     <w:p>
       <w:pPr>
         <w:pStyle w:val="Heading2"/>
+        <w:pageBreakBefore/>
+        <w:spacing w:before="0"/>
       </w:pPr>
       <w:r>
         <w:t>Principal Data Engineer / Data Consultant</w:t>
@@ -248,7 +268,7 @@
         <w:pStyle w:val="CVMetadata"/>
       </w:pPr>
       <w:r>
-        <w:t>Intuita Consulting, London, UK | Aug 2022 - Feb 2024</w:t>
+        <w:t>Intuita Consulting (UK group) | Sep 2022 - Feb 2024</w:t>
       </w:r>
     </w:p>
     <w:p>
@@ -314,7 +334,7 @@
         </w:r>
       </w:hyperlink>
       <w:r>
-        <w:t xml:space="preserve">: led data modelling and integration of marketing sources using Snowflake, dbt and Matillion. Built </w:t>
+        <w:t xml:space="preserve">: integrated Google Analytics, email campaigns, Salesforce, paid advertising and social-channel data into unified marketing analytics in Snowflake using dbt, Matillion and SQL. Built </w:t>
       </w:r>
       <w:hyperlink r:id="rId15">
         <w:r>
@@ -322,11 +342,11 @@
             <w:color w:val="173D59"/>
             <w:u w:val="none"/>
           </w:rPr>
-          <w:t>Airflow/Python ingestion and Redshift transformation workflows</w:t>
+          <w:t>DataDQ advertising-data workflows</w:t>
         </w:r>
       </w:hyperlink>
       <w:r>
-        <w:t xml:space="preserve"> on a separate Intuita engagement.</w:t>
+        <w:t xml:space="preserve"> with Airflow, S3 and Redshift.</w:t>
       </w:r>
     </w:p>
     <w:p>
@@ -377,8 +397,6 @@
     <w:p>
       <w:pPr>
         <w:pStyle w:val="Heading1"/>
-        <w:pageBreakBefore/>
-        <w:spacing w:before="0"/>
       </w:pPr>
       <w:r>
         <w:t>Further architecture, AI and education experience</w:t>
@@ -534,6 +552,8 @@
     <w:p>
       <w:pPr>
         <w:pStyle w:val="Heading2"/>
+        <w:pageBreakBefore/>
+        <w:spacing w:before="0"/>
       </w:pPr>
       <w:r>
         <w:t>Data Architect / Head of AI</w:t>
@@ -565,7 +585,7 @@
         </w:numPr>
       </w:pPr>
       <w:r>
-        <w:t>Developed AWS-based ML/ETL components for audio analysis using S3, Lambda, EFS, RDS connectivity and OpenSearch, with automated build/deployment through CodeBuild, SAM and CloudFormation. Built Python/TensorFlow audio-feature and genre-classification prototypes.</w:t>
+        <w:t>Developed AWS audio-processing components with S3, Lambda, EFS, PostgreSQL/RDS, SAM, CloudFormation and CodeBuild. Integrated pretrained models for genre, style, mood, instrumentation and danceability; built audio-feature extraction, metadata processing and an interactive waveform demonstration. Designed a recommendation-service architecture.</w:t>
       </w:r>
     </w:p>
     <w:p>
@@ -580,8 +600,17 @@
       <w:pPr>
         <w:pStyle w:val="CVMetadata"/>
       </w:pPr>
+      <w:hyperlink r:id="rId23">
+        <w:r>
+          <w:rPr>
+            <w:color w:val="173D59"/>
+            <w:u w:val="none"/>
+          </w:rPr>
+          <w:t>Algebra / Algebra LAB</w:t>
+        </w:r>
+      </w:hyperlink>
       <w:r>
-        <w:t>Algebra / Algebra LAB | Mar 2018 - Sep 2022</w:t>
+        <w:t xml:space="preserve"> | Mar 2018 - Sep 2022</w:t>
       </w:r>
     </w:p>
     <w:p>
@@ -592,7 +621,7 @@
           <w:numId w:val="10"/>
         </w:numPr>
       </w:pPr>
-      <w:hyperlink r:id="rId23">
+      <w:hyperlink r:id="rId24">
         <w:r>
           <w:rPr>
             <w:color w:val="173D59"/>
@@ -614,19 +643,19 @@
         </w:numPr>
       </w:pPr>
       <w:r>
-        <w:t xml:space="preserve">Delivered data engineering, analytics and applied ML work across research and public-sector projects; developed computer-vision demonstrations and educational material for the </w:t>
+        <w:t xml:space="preserve">Delivered data engineering and applied ML projects, including computer-vision software and practical notebooks for </w:t>
       </w:r>
-      <w:hyperlink r:id="rId24">
+      <w:hyperlink r:id="rId25">
         <w:r>
           <w:rPr>
             <w:color w:val="173D59"/>
             <w:u w:val="none"/>
           </w:rPr>
-          <w:t>Erasmus ADSEE programme</w:t>
+          <w:t>Erasmus ADSEE</w:t>
         </w:r>
       </w:hyperlink>
       <w:r>
-        <w:t>.</w:t>
+        <w:t>. Taught Disruptive Technologies on the Data Science master's programme and E-business on the Software Engineering graduate programme.</w:t>
       </w:r>
     </w:p>
     <w:p>
@@ -636,7 +665,7 @@
       <w:r>
         <w:t xml:space="preserve">Earlier experience: </w:t>
       </w:r>
-      <w:hyperlink r:id="rId25">
+      <w:hyperlink r:id="rId26">
         <w:r>
           <w:rPr>
             <w:color w:val="173D59"/>
@@ -647,6 +676,119 @@
       </w:hyperlink>
       <w:r>
         <w:t>, 2002-2017 - information systems development and integration, technical leadership, digital learning and professional education.</w:t>
+      </w:r>
+    </w:p>
+    <w:p>
+      <w:pPr>
+        <w:pStyle w:val="Heading1"/>
+      </w:pPr>
+      <w:r>
+        <w:t>Additional project work</w:t>
+      </w:r>
+    </w:p>
+    <w:p>
+      <w:pPr>
+        <w:pStyle w:val="CVBullet"/>
+        <w:numPr>
+          <w:ilvl w:val="0"/>
+          <w:numId w:val="10"/>
+        </w:numPr>
+      </w:pPr>
+      <w:hyperlink r:id="rId27">
+        <w:r>
+          <w:rPr>
+            <w:color w:val="173D59"/>
+            <w:u w:val="none"/>
+          </w:rPr>
+          <w:t>Vehicle-market analytics and price prediction</w:t>
+        </w:r>
+      </w:hyperlink>
+      <w:r>
+        <w:t>: developed an XGBoost car-price model for Oglasnik.hr, with Tableau and Power BI analytics. Built an independent Airflow/PostgreSQL collection platform with new-ad detection and price-change tracking.</w:t>
+      </w:r>
+    </w:p>
+    <w:p>
+      <w:pPr>
+        <w:pStyle w:val="CVBullet"/>
+        <w:numPr>
+          <w:ilvl w:val="0"/>
+          <w:numId w:val="10"/>
+        </w:numPr>
+      </w:pPr>
+      <w:hyperlink r:id="rId28">
+        <w:r>
+          <w:rPr>
+            <w:color w:val="173D59"/>
+            <w:u w:val="none"/>
+          </w:rPr>
+          <w:t>Desktop property analytics</w:t>
+        </w:r>
+      </w:hyperlink>
+      <w:r>
+        <w:t>: developed a Python/PyQt5 application for collecting, filtering and analysing property listings, with configurable notifications.</w:t>
+      </w:r>
+    </w:p>
+    <w:p>
+      <w:pPr>
+        <w:pStyle w:val="CVBullet"/>
+        <w:numPr>
+          <w:ilvl w:val="0"/>
+          <w:numId w:val="10"/>
+        </w:numPr>
+      </w:pPr>
+      <w:hyperlink r:id="rId29">
+        <w:r>
+          <w:rPr>
+            <w:color w:val="173D59"/>
+            <w:u w:val="none"/>
+          </w:rPr>
+          <w:t>News portal</w:t>
+        </w:r>
+      </w:hyperlink>
+      <w:r>
+        <w:t>: built Python/PostgreSQL collection, Dagster jobs, AI summaries and article/category publishing; developed the project using Oracle Cloud.</w:t>
+      </w:r>
+    </w:p>
+    <w:p>
+      <w:pPr>
+        <w:pStyle w:val="CVBullet"/>
+        <w:numPr>
+          <w:ilvl w:val="0"/>
+          <w:numId w:val="10"/>
+        </w:numPr>
+      </w:pPr>
+      <w:hyperlink r:id="rId30">
+        <w:r>
+          <w:rPr>
+            <w:color w:val="173D59"/>
+            <w:u w:val="none"/>
+          </w:rPr>
+          <w:t>Occupational and professional registers</w:t>
+        </w:r>
+      </w:hyperlink>
+      <w:r>
+        <w:t>: built C#/ASP.NET Core applications with linked reference data, search, editing, access management and change-history views.</w:t>
+      </w:r>
+    </w:p>
+    <w:p>
+      <w:pPr>
+        <w:pStyle w:val="CVBullet"/>
+        <w:numPr>
+          <w:ilvl w:val="0"/>
+          <w:numId w:val="10"/>
+        </w:numPr>
+      </w:pPr>
+      <w:hyperlink r:id="rId31">
+        <w:r>
+          <w:rPr>
+            <w:color w:val="173D59"/>
+            <w:u w:val="none"/>
+          </w:rPr>
+          <w:t>eFTI portal</w:t>
+        </w:r>
+      </w:hyperlink>
+      <w:r>
+        <w:t>: developed Java/Spring Boot and React/TypeScript software for freight datasets, XML validation, subset selection, access links and audit.</w:t>
       </w:r>
     </w:p>
     <w:p>
@@ -701,7 +843,7 @@
       <w:pPr>
         <w:pStyle w:val="CVEducation"/>
       </w:pPr>
-      <w:hyperlink r:id="rId26">
+      <w:hyperlink r:id="rId32">
         <w:r>
           <w:rPr>
             <w:color w:val="173D59"/>
@@ -712,7 +854,7 @@
       </w:hyperlink>
     </w:p>
     <w:sectPr>
-      <w:footerReference w:type="default" r:id="rId27"/>
+      <w:footerReference w:type="default" r:id="rId33"/>
       <w:pgSz w:w="11906" w:h="16838"/>
       <w:pgMar w:top="1020" w:right="1020" w:bottom="1020" w:left="1020" w:header="510" w:footer="510" w:gutter="0"/>
       <w:cols w:space="720"/>

</xml_diff>

<commit_message>
Expand technical case studies and confirm teaching and Argos delivery
</commit_message>
<xml_diff>
--- a/assets/Hrvoje_Jerkovic_CV_EN.docx
+++ b/assets/Hrvoje_Jerkovic_CV_EN.docx
@@ -379,7 +379,7 @@
         </w:r>
       </w:hyperlink>
       <w:r>
-        <w:t xml:space="preserve"> for metadata and database-change capture. </w:t>
+        <w:t xml:space="preserve"> for metadata extraction and schema-change capture. </w:t>
       </w:r>
       <w:hyperlink r:id="rId18">
         <w:r>
@@ -643,7 +643,7 @@
         </w:numPr>
       </w:pPr>
       <w:r>
-        <w:t xml:space="preserve">Delivered data engineering and applied ML projects, including computer-vision software and practical notebooks for </w:t>
+        <w:t xml:space="preserve">Delivered data engineering and computer-vision projects, including </w:t>
       </w:r>
       <w:hyperlink r:id="rId25">
         <w:r>
@@ -655,7 +655,7 @@
         </w:r>
       </w:hyperlink>
       <w:r>
-        <w:t>. Taught Disruptive Technologies on the Data Science master's programme and E-business on the Software Engineering graduate programme.</w:t>
+        <w:t>. Course leader for Machine Learning on the Data Science master's, delivering part of its lectures and practical exercises; also taught Disruptive Technologies and E-business.</w:t>
       </w:r>
     </w:p>
     <w:p>

</xml_diff>

<commit_message>
Clarify CV role, credentials and institution names; link official eADR website
</commit_message>
<xml_diff>
--- a/assets/Hrvoje_Jerkovic_CV_EN.docx
+++ b/assets/Hrvoje_Jerkovic_CV_EN.docx
@@ -71,7 +71,7 @@
     <w:p>
       <w:pPr/>
       <w:r>
-        <w:t>Data and solution architect combining hands-on engineering, technical leadership and education. Data and ML project experience since 2017, with a broader background in information systems. Specialises in lakehouse modernisation, lineage, reliable pipelines and AI-assisted migration across financial services, UK consulting and the public sector.</w:t>
+        <w:t>Data and solution architect combining hands-on engineering, technical leadership and education. Data and ML project experience since 2017, with a broader background in information systems. Specialises in lakehouse modernisation, lineage, reliable pipelines and AI-assisted migration across financial services, consulting and the public sector.</w:t>
       </w:r>
     </w:p>
     <w:p>
@@ -260,7 +260,7 @@
         <w:spacing w:before="0"/>
       </w:pPr>
       <w:r>
-        <w:t>Principal Data Engineer / Data Consultant</w:t>
+        <w:t>Data Architect / Principal Data Engineer / Data Consultant</w:t>
       </w:r>
     </w:p>
     <w:p>
@@ -420,7 +420,7 @@
             <w:color w:val="173D59"/>
             <w:u w:val="none"/>
           </w:rPr>
-          <w:t>AKD / Croatian Ministry of the Sea, Transport and Infrastructure</w:t>
+          <w:t>Agency for Commercial Activities (AKD) / Croatian Ministry of the Sea, Transport and Infrastructure</w:t>
         </w:r>
       </w:hyperlink>
       <w:r>
@@ -518,7 +518,7 @@
             <w:color w:val="173D59"/>
             <w:u w:val="none"/>
           </w:rPr>
-          <w:t>AKD / Croatian Ministry of the Sea, Transport and Infrastructure</w:t>
+          <w:t>Agency for Commercial Activities (AKD) / Croatian Ministry of the Sea, Transport and Infrastructure</w:t>
         </w:r>
       </w:hyperlink>
       <w:r>
@@ -828,7 +828,7 @@
         <w:pStyle w:val="CVEducation"/>
       </w:pPr>
       <w:r>
-        <w:t>Previous credentials: SnowPro Core (2024; expired Jan 2026); AWS Cloud Practitioner (2022).</w:t>
+        <w:t>Credentials: SnowPro Core (2024); AWS Cloud Practitioner (2022).</w:t>
       </w:r>
     </w:p>
     <w:p>

</xml_diff>

<commit_message>
Add national agriculture and regulated-profession projects; deepen labour-market analytics
</commit_message>
<xml_diff>
--- a/assets/Hrvoje_Jerkovic_CV_EN.docx
+++ b/assets/Hrvoje_Jerkovic_CV_EN.docx
@@ -642,10 +642,43 @@
           <w:numId w:val="10"/>
         </w:numPr>
       </w:pPr>
+      <w:hyperlink r:id="rId25">
+        <w:r>
+          <w:rPr>
+            <w:color w:val="173D59"/>
+            <w:u w:val="none"/>
+          </w:rPr>
+          <w:t>National labour-market analytics</w:t>
+        </w:r>
+      </w:hyperlink>
+      <w:r>
+        <w:t xml:space="preserve">: migrated analytical processing to SQL Server and integrated employment and education data. </w:t>
+      </w:r>
+      <w:hyperlink r:id="rId26">
+        <w:r>
+          <w:rPr>
+            <w:color w:val="173D59"/>
+            <w:u w:val="none"/>
+          </w:rPr>
+          <w:t>Agricultural analytics</w:t>
+        </w:r>
+      </w:hyperlink>
+      <w:r>
+        <w:t>: developed complex SQL views, a large Tableau Hyper extract and ministry-wide dashboards.</w:t>
+      </w:r>
+    </w:p>
+    <w:p>
+      <w:pPr>
+        <w:pStyle w:val="CVBullet"/>
+        <w:numPr>
+          <w:ilvl w:val="0"/>
+          <w:numId w:val="10"/>
+        </w:numPr>
+      </w:pPr>
       <w:r>
         <w:t xml:space="preserve">Delivered data engineering and computer-vision projects, including </w:t>
       </w:r>
-      <w:hyperlink r:id="rId25">
+      <w:hyperlink r:id="rId27">
         <w:r>
           <w:rPr>
             <w:color w:val="173D59"/>
@@ -665,7 +698,7 @@
       <w:r>
         <w:t xml:space="preserve">Earlier experience: </w:t>
       </w:r>
-      <w:hyperlink r:id="rId26">
+      <w:hyperlink r:id="rId28">
         <w:r>
           <w:rPr>
             <w:color w:val="173D59"/>
@@ -694,7 +727,7 @@
           <w:numId w:val="10"/>
         </w:numPr>
       </w:pPr>
-      <w:hyperlink r:id="rId27">
+      <w:hyperlink r:id="rId29">
         <w:r>
           <w:rPr>
             <w:color w:val="173D59"/>
@@ -715,7 +748,7 @@
           <w:numId w:val="10"/>
         </w:numPr>
       </w:pPr>
-      <w:hyperlink r:id="rId28">
+      <w:hyperlink r:id="rId30">
         <w:r>
           <w:rPr>
             <w:color w:val="173D59"/>
@@ -736,7 +769,7 @@
           <w:numId w:val="10"/>
         </w:numPr>
       </w:pPr>
-      <w:hyperlink r:id="rId29">
+      <w:hyperlink r:id="rId31">
         <w:r>
           <w:rPr>
             <w:color w:val="173D59"/>
@@ -757,17 +790,29 @@
           <w:numId w:val="10"/>
         </w:numPr>
       </w:pPr>
-      <w:hyperlink r:id="rId30">
+      <w:hyperlink r:id="rId32">
         <w:r>
           <w:rPr>
             <w:color w:val="173D59"/>
             <w:u w:val="none"/>
           </w:rPr>
-          <w:t>Occupational and professional registers</w:t>
+          <w:t>National register of regulated professions</w:t>
         </w:r>
       </w:hyperlink>
       <w:r>
-        <w:t>: built C#/ASP.NET Core applications with linked reference data, search, editing, access management and change-history views.</w:t>
+        <w:t xml:space="preserve"> and </w:t>
+      </w:r>
+      <w:hyperlink r:id="rId33">
+        <w:r>
+          <w:rPr>
+            <w:color w:val="173D59"/>
+            <w:u w:val="none"/>
+          </w:rPr>
+          <w:t>occupational classifications</w:t>
+        </w:r>
+      </w:hyperlink>
+      <w:r>
+        <w:t>: built SQL Server databases and C#/ASP.NET Core applications for nationwide reference-data maintenance, search, editing and audit.</w:t>
       </w:r>
     </w:p>
     <w:p>
@@ -778,7 +823,7 @@
           <w:numId w:val="10"/>
         </w:numPr>
       </w:pPr>
-      <w:hyperlink r:id="rId31">
+      <w:hyperlink r:id="rId34">
         <w:r>
           <w:rPr>
             <w:color w:val="173D59"/>
@@ -843,7 +888,7 @@
       <w:pPr>
         <w:pStyle w:val="CVEducation"/>
       </w:pPr>
-      <w:hyperlink r:id="rId32">
+      <w:hyperlink r:id="rId35">
         <w:r>
           <w:rPr>
             <w:color w:val="173D59"/>
@@ -854,7 +899,7 @@
       </w:hyperlink>
     </w:p>
     <w:sectPr>
-      <w:footerReference w:type="default" r:id="rId33"/>
+      <w:footerReference w:type="default" r:id="rId36"/>
       <w:pgSz w:w="11906" w:h="16838"/>
       <w:pgMar w:top="1020" w:right="1020" w:bottom="1020" w:left="1020" w:header="510" w:footer="510" w:gutter="0"/>
       <w:cols w:space="720"/>

</xml_diff>

<commit_message>
Describe CBO architecture, prototypes and final evaluation; enrich agriculture evidence
</commit_message>
<xml_diff>
--- a/assets/Hrvoje_Jerkovic_CV_EN.docx
+++ b/assets/Hrvoje_Jerkovic_CV_EN.docx
@@ -505,6 +505,55 @@
         <w:pStyle w:val="Heading2"/>
       </w:pPr>
       <w:r>
+        <w:t>Lead Data Architect / Project Manager - Technical Bid</w:t>
+      </w:r>
+    </w:p>
+    <w:p>
+      <w:pPr>
+        <w:pStyle w:val="CVMetadata"/>
+      </w:pPr>
+      <w:hyperlink r:id="rId21">
+        <w:r>
+          <w:rPr>
+            <w:color w:val="173D59"/>
+            <w:u w:val="none"/>
+          </w:rPr>
+          <w:t>NEOS / Central Bank of Oman — pre-contract evaluation</w:t>
+        </w:r>
+      </w:hyperlink>
+      <w:r>
+        <w:t xml:space="preserve"> | Sep 2025 - Feb 2026</w:t>
+      </w:r>
+    </w:p>
+    <w:p>
+      <w:pPr>
+        <w:pStyle w:val="CVBullet"/>
+        <w:numPr>
+          <w:ilvl w:val="0"/>
+          <w:numId w:val="10"/>
+        </w:numPr>
+      </w:pPr>
+      <w:r>
+        <w:t>Led solution design and technical coordination; developed a FastAPI/Vue demonstration application and prototypes for regulatory returns, submissions, revisions and analytics, alongside the proposed on-premises lakehouse architecture.</w:t>
+      </w:r>
+    </w:p>
+    <w:p>
+      <w:pPr>
+        <w:pStyle w:val="CVBullet"/>
+        <w:numPr>
+          <w:ilvl w:val="0"/>
+          <w:numId w:val="10"/>
+        </w:numPr>
+      </w:pPr>
+      <w:r>
+        <w:t>Reached final-stage evaluation with the NEOS team and presented my work and project references to the bank’s delegation in Zagreb. The engagement did not progress to contract award or production implementation.</w:t>
+      </w:r>
+    </w:p>
+    <w:p>
+      <w:pPr>
+        <w:pStyle w:val="Heading2"/>
+      </w:pPr>
+      <w:r>
         <w:t>Data Architect / Technical Lead - Road Transport Analytics</w:t>
       </w:r>
     </w:p>
@@ -512,7 +561,7 @@
       <w:pPr>
         <w:pStyle w:val="CVMetadata"/>
       </w:pPr>
-      <w:hyperlink r:id="rId21">
+      <w:hyperlink r:id="rId22">
         <w:r>
           <w:rPr>
             <w:color w:val="173D59"/>
@@ -563,7 +612,7 @@
       <w:pPr>
         <w:pStyle w:val="CVMetadata"/>
       </w:pPr>
-      <w:hyperlink r:id="rId22">
+      <w:hyperlink r:id="rId23">
         <w:r>
           <w:rPr>
             <w:color w:val="173D59"/>
@@ -600,7 +649,7 @@
       <w:pPr>
         <w:pStyle w:val="CVMetadata"/>
       </w:pPr>
-      <w:hyperlink r:id="rId23">
+      <w:hyperlink r:id="rId24">
         <w:r>
           <w:rPr>
             <w:color w:val="173D59"/>
@@ -621,7 +670,7 @@
           <w:numId w:val="10"/>
         </w:numPr>
       </w:pPr>
-      <w:hyperlink r:id="rId24">
+      <w:hyperlink r:id="rId25">
         <w:r>
           <w:rPr>
             <w:color w:val="173D59"/>
@@ -642,7 +691,7 @@
           <w:numId w:val="10"/>
         </w:numPr>
       </w:pPr>
-      <w:hyperlink r:id="rId25">
+      <w:hyperlink r:id="rId26">
         <w:r>
           <w:rPr>
             <w:color w:val="173D59"/>
@@ -654,7 +703,7 @@
       <w:r>
         <w:t xml:space="preserve">: migrated analytical processing to SQL Server and integrated employment and education data. </w:t>
       </w:r>
-      <w:hyperlink r:id="rId26">
+      <w:hyperlink r:id="rId27">
         <w:r>
           <w:rPr>
             <w:color w:val="173D59"/>
@@ -678,7 +727,7 @@
       <w:r>
         <w:t xml:space="preserve">Delivered data engineering and computer-vision projects, including </w:t>
       </w:r>
-      <w:hyperlink r:id="rId27">
+      <w:hyperlink r:id="rId28">
         <w:r>
           <w:rPr>
             <w:color w:val="173D59"/>
@@ -698,7 +747,7 @@
       <w:r>
         <w:t xml:space="preserve">Earlier experience: </w:t>
       </w:r>
-      <w:hyperlink r:id="rId28">
+      <w:hyperlink r:id="rId29">
         <w:r>
           <w:rPr>
             <w:color w:val="173D59"/>
@@ -727,7 +776,7 @@
           <w:numId w:val="10"/>
         </w:numPr>
       </w:pPr>
-      <w:hyperlink r:id="rId29">
+      <w:hyperlink r:id="rId30">
         <w:r>
           <w:rPr>
             <w:color w:val="173D59"/>
@@ -748,7 +797,7 @@
           <w:numId w:val="10"/>
         </w:numPr>
       </w:pPr>
-      <w:hyperlink r:id="rId30">
+      <w:hyperlink r:id="rId31">
         <w:r>
           <w:rPr>
             <w:color w:val="173D59"/>
@@ -769,7 +818,7 @@
           <w:numId w:val="10"/>
         </w:numPr>
       </w:pPr>
-      <w:hyperlink r:id="rId31">
+      <w:hyperlink r:id="rId32">
         <w:r>
           <w:rPr>
             <w:color w:val="173D59"/>
@@ -790,7 +839,7 @@
           <w:numId w:val="10"/>
         </w:numPr>
       </w:pPr>
-      <w:hyperlink r:id="rId32">
+      <w:hyperlink r:id="rId33">
         <w:r>
           <w:rPr>
             <w:color w:val="173D59"/>
@@ -802,7 +851,7 @@
       <w:r>
         <w:t xml:space="preserve"> and </w:t>
       </w:r>
-      <w:hyperlink r:id="rId33">
+      <w:hyperlink r:id="rId34">
         <w:r>
           <w:rPr>
             <w:color w:val="173D59"/>
@@ -823,7 +872,7 @@
           <w:numId w:val="10"/>
         </w:numPr>
       </w:pPr>
-      <w:hyperlink r:id="rId34">
+      <w:hyperlink r:id="rId35">
         <w:r>
           <w:rPr>
             <w:color w:val="173D59"/>
@@ -888,7 +937,7 @@
       <w:pPr>
         <w:pStyle w:val="CVEducation"/>
       </w:pPr>
-      <w:hyperlink r:id="rId35">
+      <w:hyperlink r:id="rId36">
         <w:r>
           <w:rPr>
             <w:color w:val="173D59"/>
@@ -899,7 +948,7 @@
       </w:hyperlink>
     </w:p>
     <w:sectPr>
-      <w:footerReference w:type="default" r:id="rId36"/>
+      <w:footerReference w:type="default" r:id="rId37"/>
       <w:pgSz w:w="11906" w:h="16838"/>
       <w:pgMar w:top="1020" w:right="1020" w:bottom="1020" w:left="1020" w:header="510" w:footer="510" w:gutter="0"/>
       <w:cols w:space="720"/>

</xml_diff>

<commit_message>
Clarify CV credentials and roles; consolidate repetitive project details
</commit_message>
<xml_diff>
--- a/assets/Hrvoje_Jerkovic_CV_EN.docx
+++ b/assets/Hrvoje_Jerkovic_CV_EN.docx
@@ -148,10 +148,10 @@
         <w:rPr>
           <w:b/>
         </w:rPr>
-        <w:t xml:space="preserve">Analytics and marketing: </w:t>
+        <w:t xml:space="preserve">Analytics and digital marketing: </w:t>
       </w:r>
       <w:r>
-        <w:t>Google Analytics, e-marketing, cross-channel data integration, Tableau, Power BI and DAX.</w:t>
+        <w:t>Google Analytics, Google Ads (AdWords), Google AdSense, Google Search Console (Webmaster Tools), Facebook/Meta marketing, cross-channel data integration, Tableau, Power BI and DAX.</w:t>
       </w:r>
     </w:p>
     <w:p>
@@ -701,7 +701,7 @@
         </w:r>
       </w:hyperlink>
       <w:r>
-        <w:t xml:space="preserve">: migrated analytical processing to SQL Server and integrated employment and education data. </w:t>
+        <w:t xml:space="preserve">: served as Data Architect / Lead Data Engineer, migrated analytical processing to SQL Server and integrated employment and education data. </w:t>
       </w:r>
       <w:hyperlink r:id="rId27">
         <w:r>
@@ -887,6 +887,18 @@
     </w:p>
     <w:p>
       <w:pPr>
+        <w:pStyle w:val="CVBullet"/>
+        <w:numPr>
+          <w:ilvl w:val="0"/>
+          <w:numId w:val="10"/>
+        </w:numPr>
+      </w:pPr>
+      <w:r>
+        <w:t>Independent websites and digital marketing: built and maintained websites, configured analytics and marketing tools, and taught these skills through practical student work.</w:t>
+      </w:r>
+    </w:p>
+    <w:p>
+      <w:pPr>
         <w:pStyle w:val="Heading1"/>
       </w:pPr>
       <w:r>
@@ -933,22 +945,8 @@
         <w:t>Languages: English - full professional proficiency, including consulting and teaching; Croatian - native.</w:t>
       </w:r>
     </w:p>
-    <w:p>
-      <w:pPr>
-        <w:pStyle w:val="CVEducation"/>
-      </w:pPr>
-      <w:hyperlink r:id="rId36">
-        <w:r>
-          <w:rPr>
-            <w:color w:val="173D59"/>
-            <w:u w:val="none"/>
-          </w:rPr>
-          <w:t>Public Databricks workshop materials</w:t>
-        </w:r>
-      </w:hyperlink>
-    </w:p>
     <w:sectPr>
-      <w:footerReference w:type="default" r:id="rId37"/>
+      <w:footerReference w:type="default" r:id="rId36"/>
       <w:pgSz w:w="11906" w:h="16838"/>
       <w:pgMar w:top="1020" w:right="1020" w:bottom="1020" w:left="1020" w:header="510" w:footer="510" w:gutter="0"/>
       <w:cols w:space="720"/>

</xml_diff>

<commit_message>
Give each CV project its own bullet and description
</commit_message>
<xml_diff>
--- a/assets/Hrvoje_Jerkovic_CV_EN.docx
+++ b/assets/Hrvoje_Jerkovic_CV_EN.docx
@@ -334,7 +334,19 @@
         </w:r>
       </w:hyperlink>
       <w:r>
-        <w:t xml:space="preserve">: integrated Google Analytics, email campaigns, Salesforce, paid advertising and social-channel data into unified marketing analytics in Snowflake using dbt, Matillion and SQL. Built </w:t>
+        <w:t>: integrated Google Analytics, email campaigns, Salesforce, paid advertising and social-channel data into unified marketing analytics in Snowflake using dbt, Matillion and SQL.</w:t>
+      </w:r>
+    </w:p>
+    <w:p>
+      <w:pPr>
+        <w:pStyle w:val="CVBullet"/>
+        <w:numPr>
+          <w:ilvl w:val="0"/>
+          <w:numId w:val="10"/>
+        </w:numPr>
+      </w:pPr>
+      <w:r>
+        <w:t xml:space="preserve">Built </w:t>
       </w:r>
       <w:hyperlink r:id="rId15">
         <w:r>
@@ -346,7 +358,7 @@
         </w:r>
       </w:hyperlink>
       <w:r>
-        <w:t xml:space="preserve"> with Airflow, S3 and Redshift.</w:t>
+        <w:t xml:space="preserve"> with Airflow, S3 and Redshift. Implemented file ingestion, staging-table loads and updates for advertising viewability data.</w:t>
       </w:r>
     </w:p>
     <w:p>
@@ -363,24 +375,42 @@
             <w:color w:val="173D59"/>
             <w:u w:val="none"/>
           </w:rPr>
-          <w:t>Comcast / Sky</w:t>
+          <w:t>Comcast / Sky — metadata engineering</w:t>
         </w:r>
       </w:hyperlink>
       <w:r>
-        <w:t xml:space="preserve">: developed a metadata extraction solution using Python, PostgreSQL and Collibra, and a separate tested </w:t>
+        <w:t>: developed Python extraction and PostgreSQL models for Confluence documentation, structuring table, column, business and governance metadata for analysis and the wider Collibra environment.</w:t>
       </w:r>
+    </w:p>
+    <w:p>
+      <w:pPr>
+        <w:pStyle w:val="CVBullet"/>
+        <w:numPr>
+          <w:ilvl w:val="0"/>
+          <w:numId w:val="10"/>
+        </w:numPr>
+      </w:pPr>
       <w:hyperlink r:id="rId17">
         <w:r>
           <w:rPr>
             <w:color w:val="173D59"/>
             <w:u w:val="none"/>
           </w:rPr>
-          <w:t>GCP/AlloyDB prototype</w:t>
+          <w:t>Comcast / Sky — GCP/AlloyDB prototype</w:t>
         </w:r>
       </w:hyperlink>
       <w:r>
-        <w:t xml:space="preserve"> for metadata extraction and schema-change capture. </w:t>
+        <w:t>: built and tested schema-metadata capture using SQL and PL/pgSQL, with metadata refresh after DDL changes and audit records for table and column changes.</w:t>
       </w:r>
+    </w:p>
+    <w:p>
+      <w:pPr>
+        <w:pStyle w:val="CVBullet"/>
+        <w:numPr>
+          <w:ilvl w:val="0"/>
+          <w:numId w:val="10"/>
+        </w:numPr>
+      </w:pPr>
       <w:hyperlink r:id="rId18">
         <w:r>
           <w:rPr>
@@ -391,7 +421,7 @@
         </w:r>
       </w:hyperlink>
       <w:r>
-        <w:t>: mapped telecom data models to TM Forum SID/ODA using ER/UML modelling tools.</w:t>
+        <w:t>: mapped telecom data models to TM Forum SID/ODA using ER/UML modelling tools, connecting business processes, database entities and attributes with the industry information model.</w:t>
       </w:r>
     </w:p>
     <w:p>
@@ -701,8 +731,17 @@
         </w:r>
       </w:hyperlink>
       <w:r>
-        <w:t xml:space="preserve">: served as Data Architect / Lead Data Engineer, migrated analytical processing to SQL Server and integrated employment and education data. </w:t>
+        <w:t>: served as Data Architect / Lead Data Engineer, migrated analytical processing to SQL Server and integrated employment and education data.</w:t>
       </w:r>
+    </w:p>
+    <w:p>
+      <w:pPr>
+        <w:pStyle w:val="CVBullet"/>
+        <w:numPr>
+          <w:ilvl w:val="0"/>
+          <w:numId w:val="10"/>
+        </w:numPr>
+      </w:pPr>
       <w:hyperlink r:id="rId27">
         <w:r>
           <w:rPr>
@@ -724,9 +763,6 @@
           <w:numId w:val="10"/>
         </w:numPr>
       </w:pPr>
-      <w:r>
-        <w:t xml:space="preserve">Delivered data engineering and computer-vision projects, including </w:t>
-      </w:r>
       <w:hyperlink r:id="rId28">
         <w:r>
           <w:rPr>
@@ -737,7 +773,19 @@
         </w:r>
       </w:hyperlink>
       <w:r>
-        <w:t>. Course leader for Machine Learning on the Data Science master's, delivering part of its lectures and practical exercises; also taught Disruptive Technologies and E-business.</w:t>
+        <w:t>: developed computer-vision demonstrations and educational material using Python, OpenCV and Jupyter, connecting video preparation, detections and analytical tables.</w:t>
+      </w:r>
+    </w:p>
+    <w:p>
+      <w:pPr>
+        <w:pStyle w:val="CVBullet"/>
+        <w:numPr>
+          <w:ilvl w:val="0"/>
+          <w:numId w:val="10"/>
+        </w:numPr>
+      </w:pPr>
+      <w:r>
+        <w:t>Course leader for Machine Learning on the Data Science master's, delivering part of its lectures and practical exercises; also taught Disruptive Technologies and E-business.</w:t>
       </w:r>
     </w:p>
     <w:p>
@@ -849,19 +897,28 @@
         </w:r>
       </w:hyperlink>
       <w:r>
-        <w:t xml:space="preserve"> and </w:t>
+        <w:t>: designed the SQL Server database and developed a C#/ASP.NET Core application for profession records, qualification-recognition information, search, editing and audit.</w:t>
       </w:r>
+    </w:p>
+    <w:p>
+      <w:pPr>
+        <w:pStyle w:val="CVBullet"/>
+        <w:numPr>
+          <w:ilvl w:val="0"/>
+          <w:numId w:val="10"/>
+        </w:numPr>
+      </w:pPr>
       <w:hyperlink r:id="rId34">
         <w:r>
           <w:rPr>
             <w:color w:val="173D59"/>
             <w:u w:val="none"/>
           </w:rPr>
-          <w:t>occupational classifications</w:t>
+          <w:t>Occupational classifications</w:t>
         </w:r>
       </w:hyperlink>
       <w:r>
-        <w:t>: built SQL Server databases and C#/ASP.NET Core applications for nationwide reference-data maintenance, search, editing and audit.</w:t>
+        <w:t>: developed SQL Server and C#/ASP.NET Core software for maintaining Croatian occupational codes and their relationships with the Croatian Qualifications Framework, including search and change history.</w:t>
       </w:r>
     </w:p>
     <w:p>

</xml_diff>

<commit_message>
Clarify CV wording and document ZSEM and AKD teaching experience
</commit_message>
<xml_diff>
--- a/assets/Hrvoje_Jerkovic_CV_EN.docx
+++ b/assets/Hrvoje_Jerkovic_CV_EN.docx
@@ -429,7 +429,7 @@
         <w:pStyle w:val="Heading1"/>
       </w:pPr>
       <w:r>
-        <w:t>Further architecture, AI and education experience</w:t>
+        <w:t>Further architecture, AI and education experience — most recent first</w:t>
       </w:r>
     </w:p>
     <w:p>
@@ -752,7 +752,7 @@
         </w:r>
       </w:hyperlink>
       <w:r>
-        <w:t>: developed complex SQL views, a large Tableau Hyper extract and ministry-wide dashboards.</w:t>
+        <w:t>: developed complex SQL views and Tableau dashboards for ministry-wide analysis of agricultural data.</w:t>
       </w:r>
     </w:p>
     <w:p>

</xml_diff>

<commit_message>
Clarify governance expertise and CBO architecture demonstration scope
</commit_message>
<xml_diff>
--- a/assets/Hrvoje_Jerkovic_CV_EN.docx
+++ b/assets/Hrvoje_Jerkovic_CV_EN.docx
@@ -94,10 +94,28 @@
         <w:rPr>
           <w:b/>
         </w:rPr>
-        <w:t xml:space="preserve">Architecture and governance: </w:t>
+        <w:t xml:space="preserve">Architecture: </w:t>
       </w:r>
       <w:r>
-        <w:t>lakehouse/DWH, Medallion, relational and dimensional modelling, metadata, table/column lineage, data quality, access controls and auditability.</w:t>
+        <w:t>lakehouse/DWH, Medallion, relational and dimensional modelling.</w:t>
+      </w:r>
+    </w:p>
+    <w:p>
+      <w:pPr>
+        <w:pStyle w:val="CVBullet"/>
+        <w:numPr>
+          <w:ilvl w:val="0"/>
+          <w:numId w:val="10"/>
+        </w:numPr>
+      </w:pPr>
+      <w:r>
+        <w:rPr>
+          <w:b/>
+        </w:rPr>
+        <w:t xml:space="preserve">Data governance: </w:t>
+      </w:r>
+      <w:r>
+        <w:t>Collibra, OpenMetadata, Unity Catalog, data cataloguing, metadata management, table/column lineage, data quality, access controls and auditability.</w:t>
       </w:r>
     </w:p>
     <w:p>
@@ -274,6 +292,7 @@
     <w:p>
       <w:pPr>
         <w:pStyle w:val="CVBullet"/>
+        <w:spacing w:after="30"/>
         <w:numPr>
           <w:ilvl w:val="0"/>
           <w:numId w:val="10"/>
@@ -295,6 +314,7 @@
     <w:p>
       <w:pPr>
         <w:pStyle w:val="CVBullet"/>
+        <w:spacing w:after="30"/>
         <w:numPr>
           <w:ilvl w:val="0"/>
           <w:numId w:val="10"/>
@@ -319,6 +339,7 @@
     <w:p>
       <w:pPr>
         <w:pStyle w:val="CVBullet"/>
+        <w:spacing w:after="30"/>
         <w:numPr>
           <w:ilvl w:val="0"/>
           <w:numId w:val="10"/>
@@ -340,6 +361,7 @@
     <w:p>
       <w:pPr>
         <w:pStyle w:val="CVBullet"/>
+        <w:spacing w:after="30"/>
         <w:numPr>
           <w:ilvl w:val="0"/>
           <w:numId w:val="10"/>
@@ -364,6 +386,7 @@
     <w:p>
       <w:pPr>
         <w:pStyle w:val="CVBullet"/>
+        <w:spacing w:after="30"/>
         <w:numPr>
           <w:ilvl w:val="0"/>
           <w:numId w:val="10"/>
@@ -385,6 +408,7 @@
     <w:p>
       <w:pPr>
         <w:pStyle w:val="CVBullet"/>
+        <w:spacing w:after="30"/>
         <w:numPr>
           <w:ilvl w:val="0"/>
           <w:numId w:val="10"/>
@@ -406,6 +430,7 @@
     <w:p>
       <w:pPr>
         <w:pStyle w:val="CVBullet"/>
+        <w:spacing w:after="30"/>
         <w:numPr>
           <w:ilvl w:val="0"/>
           <w:numId w:val="10"/>
@@ -460,6 +485,7 @@
     <w:p>
       <w:pPr>
         <w:pStyle w:val="CVBullet"/>
+        <w:spacing w:after="30"/>
         <w:numPr>
           <w:ilvl w:val="0"/>
           <w:numId w:val="10"/>
@@ -472,6 +498,7 @@
     <w:p>
       <w:pPr>
         <w:pStyle w:val="CVBullet"/>
+        <w:spacing w:after="30"/>
         <w:numPr>
           <w:ilvl w:val="0"/>
           <w:numId w:val="10"/>
@@ -509,6 +536,7 @@
     <w:p>
       <w:pPr>
         <w:pStyle w:val="CVBullet"/>
+        <w:spacing w:after="30"/>
         <w:numPr>
           <w:ilvl w:val="0"/>
           <w:numId w:val="10"/>
@@ -521,6 +549,7 @@
     <w:p>
       <w:pPr>
         <w:pStyle w:val="CVBullet"/>
+        <w:spacing w:after="30"/>
         <w:numPr>
           <w:ilvl w:val="0"/>
           <w:numId w:val="10"/>
@@ -535,7 +564,7 @@
         <w:pStyle w:val="Heading2"/>
       </w:pPr>
       <w:r>
-        <w:t>Lead Data Architect / Project Manager - Technical Bid</w:t>
+        <w:t>Lead Data Architect / Project Manager - Technical Bid and Demo</w:t>
       </w:r>
     </w:p>
     <w:p>
@@ -558,25 +587,27 @@
     <w:p>
       <w:pPr>
         <w:pStyle w:val="CVBullet"/>
+        <w:spacing w:after="30"/>
         <w:numPr>
           <w:ilvl w:val="0"/>
           <w:numId w:val="10"/>
         </w:numPr>
       </w:pPr>
       <w:r>
-        <w:t>Led solution design and technical coordination; developed a FastAPI/Vue demonstration application and prototypes for regulatory returns, submissions, revisions and analytics, alongside the proposed on-premises lakehouse architecture.</w:t>
+        <w:t>Led on-premises lakehouse design, technical coordination and end-to-end requirements analysis, from real-time mobile-banking scenarios to big-data analytics. Prototyped data-lake exploration, regulatory submissions, validation-rule configuration, version comparisons and payment dashboards using simulated data; designed batch/streaming ingestion, governance and analytical access.</w:t>
       </w:r>
     </w:p>
     <w:p>
       <w:pPr>
         <w:pStyle w:val="CVBullet"/>
+        <w:spacing w:after="30"/>
         <w:numPr>
           <w:ilvl w:val="0"/>
           <w:numId w:val="10"/>
         </w:numPr>
       </w:pPr>
       <w:r>
-        <w:t>Reached final-stage evaluation with the NEOS team and presented my work and project references to the bank’s delegation in Zagreb. The engagement did not progress to contract award or production implementation.</w:t>
+        <w:t>Reached final-stage evaluation with the NEOS team and presented my work and project references to the bank’s delegation in Zagreb.</w:t>
       </w:r>
     </w:p>
     <w:p>
@@ -607,6 +638,7 @@
     <w:p>
       <w:pPr>
         <w:pStyle w:val="CVBullet"/>
+        <w:spacing w:after="30"/>
         <w:numPr>
           <w:ilvl w:val="0"/>
           <w:numId w:val="10"/>
@@ -619,6 +651,7 @@
     <w:p>
       <w:pPr>
         <w:pStyle w:val="CVBullet"/>
+        <w:spacing w:after="30"/>
         <w:numPr>
           <w:ilvl w:val="0"/>
           <w:numId w:val="10"/>

</xml_diff>

<commit_message>
Clarify Affinis implementation documentation and broaden architecture and AI profile
</commit_message>
<xml_diff>
--- a/assets/Hrvoje_Jerkovic_CV_EN.docx
+++ b/assets/Hrvoje_Jerkovic_CV_EN.docx
@@ -71,7 +71,7 @@
     <w:p>
       <w:pPr/>
       <w:r>
-        <w:t>Data and solution architect combining hands-on engineering, technical leadership and education. Data and ML project experience since 2017, with a broader background in information systems. Specialises in lakehouse modernisation, lineage, reliable pipelines and AI-assisted migration across financial services, consulting and the public sector.</w:t>
+        <w:t>Data and solution architect combining hands-on engineering, technical leadership and education. Data and ML project experience since 2017, with a broader background in information systems. Specialises in lakehouse architecture, data lineage, reliable data pipelines and practical AI applications across industries, including automation, predictive analytics and data modernisation.</w:t>
       </w:r>
     </w:p>
     <w:p>
@@ -97,7 +97,7 @@
         <w:t xml:space="preserve">Architecture: </w:t>
       </w:r>
       <w:r>
-        <w:t>lakehouse/DWH, Medallion, relational and dimensional modelling.</w:t>
+        <w:t>lakehouse/DWH, Medallion, relational and dimensional modelling; platform transformation, upgrades and modernisation, cost-efficient migrations, performance and cost optimisation.</w:t>
       </w:r>
     </w:p>
     <w:p>
@@ -284,6 +284,7 @@
     <w:p>
       <w:pPr>
         <w:pStyle w:val="CVMetadata"/>
+        <w:spacing w:after="40"/>
       </w:pPr>
       <w:r>
         <w:t>Intuita Consulting (UK group) | Sep 2022 - Feb 2024</w:t>
@@ -292,7 +293,7 @@
     <w:p>
       <w:pPr>
         <w:pStyle w:val="CVBullet"/>
-        <w:spacing w:after="30"/>
+        <w:spacing w:after="10"/>
         <w:numPr>
           <w:ilvl w:val="0"/>
           <w:numId w:val="10"/>
@@ -314,7 +315,7 @@
     <w:p>
       <w:pPr>
         <w:pStyle w:val="CVBullet"/>
-        <w:spacing w:after="30"/>
+        <w:spacing w:after="10"/>
         <w:numPr>
           <w:ilvl w:val="0"/>
           <w:numId w:val="10"/>
@@ -339,7 +340,7 @@
     <w:p>
       <w:pPr>
         <w:pStyle w:val="CVBullet"/>
-        <w:spacing w:after="30"/>
+        <w:spacing w:after="10"/>
         <w:numPr>
           <w:ilvl w:val="0"/>
           <w:numId w:val="10"/>
@@ -361,7 +362,7 @@
     <w:p>
       <w:pPr>
         <w:pStyle w:val="CVBullet"/>
-        <w:spacing w:after="30"/>
+        <w:spacing w:after="10"/>
         <w:numPr>
           <w:ilvl w:val="0"/>
           <w:numId w:val="10"/>
@@ -386,7 +387,7 @@
     <w:p>
       <w:pPr>
         <w:pStyle w:val="CVBullet"/>
-        <w:spacing w:after="30"/>
+        <w:spacing w:after="10"/>
         <w:numPr>
           <w:ilvl w:val="0"/>
           <w:numId w:val="10"/>
@@ -408,7 +409,7 @@
     <w:p>
       <w:pPr>
         <w:pStyle w:val="CVBullet"/>
-        <w:spacing w:after="30"/>
+        <w:spacing w:after="10"/>
         <w:numPr>
           <w:ilvl w:val="0"/>
           <w:numId w:val="10"/>
@@ -430,7 +431,7 @@
     <w:p>
       <w:pPr>
         <w:pStyle w:val="CVBullet"/>
-        <w:spacing w:after="30"/>
+        <w:spacing w:after="10"/>
         <w:numPr>
           <w:ilvl w:val="0"/>
           <w:numId w:val="10"/>
@@ -452,6 +453,7 @@
     <w:p>
       <w:pPr>
         <w:pStyle w:val="Heading1"/>
+        <w:spacing w:before="120"/>
       </w:pPr>
       <w:r>
         <w:t>Further architecture, AI and education experience — most recent first</w:t>
@@ -460,6 +462,7 @@
     <w:p>
       <w:pPr>
         <w:pStyle w:val="Heading2"/>
+        <w:spacing w:before="100"/>
       </w:pPr>
       <w:r>
         <w:t>Solution Architect / Technical Lead - eADR</w:t>
@@ -468,6 +471,7 @@
     <w:p>
       <w:pPr>
         <w:pStyle w:val="CVMetadata"/>
+        <w:spacing w:after="40"/>
       </w:pPr>
       <w:hyperlink r:id="rId19">
         <w:r>
@@ -485,7 +489,7 @@
     <w:p>
       <w:pPr>
         <w:pStyle w:val="CVBullet"/>
-        <w:spacing w:after="30"/>
+        <w:spacing w:after="10"/>
         <w:numPr>
           <w:ilvl w:val="0"/>
           <w:numId w:val="10"/>
@@ -498,7 +502,7 @@
     <w:p>
       <w:pPr>
         <w:pStyle w:val="CVBullet"/>
-        <w:spacing w:after="30"/>
+        <w:spacing w:after="10"/>
         <w:numPr>
           <w:ilvl w:val="0"/>
           <w:numId w:val="10"/>
@@ -511,6 +515,7 @@
     <w:p>
       <w:pPr>
         <w:pStyle w:val="Heading2"/>
+        <w:spacing w:before="100"/>
       </w:pPr>
       <w:r>
         <w:t>Data Engineering Instructor / Workshop Author</w:t>
@@ -519,6 +524,7 @@
     <w:p>
       <w:pPr>
         <w:pStyle w:val="CVMetadata"/>
+        <w:spacing w:after="40"/>
       </w:pPr>
       <w:hyperlink r:id="rId20">
         <w:r>
@@ -536,7 +542,7 @@
     <w:p>
       <w:pPr>
         <w:pStyle w:val="CVBullet"/>
-        <w:spacing w:after="30"/>
+        <w:spacing w:after="10"/>
         <w:numPr>
           <w:ilvl w:val="0"/>
           <w:numId w:val="10"/>
@@ -549,7 +555,7 @@
     <w:p>
       <w:pPr>
         <w:pStyle w:val="CVBullet"/>
-        <w:spacing w:after="30"/>
+        <w:spacing w:after="10"/>
         <w:numPr>
           <w:ilvl w:val="0"/>
           <w:numId w:val="10"/>
@@ -562,6 +568,7 @@
     <w:p>
       <w:pPr>
         <w:pStyle w:val="Heading2"/>
+        <w:spacing w:before="100"/>
       </w:pPr>
       <w:r>
         <w:t>Lead Data Architect / Project Manager - Technical Bid and Demo</w:t>
@@ -570,6 +577,7 @@
     <w:p>
       <w:pPr>
         <w:pStyle w:val="CVMetadata"/>
+        <w:spacing w:after="40"/>
       </w:pPr>
       <w:hyperlink r:id="rId21">
         <w:r>
@@ -587,7 +595,7 @@
     <w:p>
       <w:pPr>
         <w:pStyle w:val="CVBullet"/>
-        <w:spacing w:after="30"/>
+        <w:spacing w:after="10"/>
         <w:numPr>
           <w:ilvl w:val="0"/>
           <w:numId w:val="10"/>
@@ -600,7 +608,7 @@
     <w:p>
       <w:pPr>
         <w:pStyle w:val="CVBullet"/>
-        <w:spacing w:after="30"/>
+        <w:spacing w:after="10"/>
         <w:numPr>
           <w:ilvl w:val="0"/>
           <w:numId w:val="10"/>
@@ -613,6 +621,7 @@
     <w:p>
       <w:pPr>
         <w:pStyle w:val="Heading2"/>
+        <w:spacing w:before="100"/>
       </w:pPr>
       <w:r>
         <w:t>Data Architect / Technical Lead - Road Transport Analytics</w:t>
@@ -621,6 +630,7 @@
     <w:p>
       <w:pPr>
         <w:pStyle w:val="CVMetadata"/>
+        <w:spacing w:after="40"/>
       </w:pPr>
       <w:hyperlink r:id="rId22">
         <w:r>
@@ -632,13 +642,22 @@
         </w:r>
       </w:hyperlink>
       <w:r>
-        <w:t xml:space="preserve"> | Jul - Dec 2024</w:t>
+        <w:t xml:space="preserve"> | Jul - Dec 2024 | </w:t>
       </w:r>
+      <w:hyperlink r:id="rId23">
+        <w:r>
+          <w:rPr>
+            <w:color w:val="173D59"/>
+            <w:u w:val="none"/>
+          </w:rPr>
+          <w:t>AKD Affinis</w:t>
+        </w:r>
+      </w:hyperlink>
     </w:p>
     <w:p>
       <w:pPr>
         <w:pStyle w:val="CVBullet"/>
-        <w:spacing w:after="30"/>
+        <w:spacing w:after="10"/>
         <w:numPr>
           <w:ilvl w:val="0"/>
           <w:numId w:val="10"/>
@@ -651,14 +670,27 @@
     <w:p>
       <w:pPr>
         <w:pStyle w:val="CVBullet"/>
-        <w:spacing w:after="30"/>
+        <w:spacing w:after="10"/>
         <w:numPr>
           <w:ilvl w:val="0"/>
           <w:numId w:val="10"/>
         </w:numPr>
       </w:pPr>
       <w:r>
-        <w:t>Prepared infrastructure and processing specifications, governance requirements and technical RFI/RFP inputs. Proposed Spark, MinIO, dbt, Dagster, OpenMetadata and PostgreSQL; aligned platform, engineering and analytics needs.</w:t>
+        <w:t>Prepared infrastructure, processing and other specifications as part of the full technical documentation used for subsequent implementation, covering Spark, MinIO, dbt, Dagster, OpenMetadata and PostgreSQL.</w:t>
+      </w:r>
+    </w:p>
+    <w:p>
+      <w:pPr>
+        <w:pStyle w:val="CVBullet"/>
+        <w:spacing w:after="10"/>
+        <w:numPr>
+          <w:ilvl w:val="0"/>
+          <w:numId w:val="10"/>
+        </w:numPr>
+      </w:pPr>
+      <w:r>
+        <w:t>Led detailed task and specification development for data engineers, DevOps and analytics specialists; evaluated candidates and defined delivery responsibilities.</w:t>
       </w:r>
     </w:p>
     <w:p>
@@ -675,7 +707,7 @@
       <w:pPr>
         <w:pStyle w:val="CVMetadata"/>
       </w:pPr>
-      <w:hyperlink r:id="rId23">
+      <w:hyperlink r:id="rId24">
         <w:r>
           <w:rPr>
             <w:color w:val="173D59"/>
@@ -712,7 +744,7 @@
       <w:pPr>
         <w:pStyle w:val="CVMetadata"/>
       </w:pPr>
-      <w:hyperlink r:id="rId24">
+      <w:hyperlink r:id="rId25">
         <w:r>
           <w:rPr>
             <w:color w:val="173D59"/>
@@ -733,7 +765,7 @@
           <w:numId w:val="10"/>
         </w:numPr>
       </w:pPr>
-      <w:hyperlink r:id="rId25">
+      <w:hyperlink r:id="rId26">
         <w:r>
           <w:rPr>
             <w:color w:val="173D59"/>
@@ -754,7 +786,7 @@
           <w:numId w:val="10"/>
         </w:numPr>
       </w:pPr>
-      <w:hyperlink r:id="rId26">
+      <w:hyperlink r:id="rId27">
         <w:r>
           <w:rPr>
             <w:color w:val="173D59"/>
@@ -775,7 +807,7 @@
           <w:numId w:val="10"/>
         </w:numPr>
       </w:pPr>
-      <w:hyperlink r:id="rId27">
+      <w:hyperlink r:id="rId28">
         <w:r>
           <w:rPr>
             <w:color w:val="173D59"/>
@@ -796,7 +828,7 @@
           <w:numId w:val="10"/>
         </w:numPr>
       </w:pPr>
-      <w:hyperlink r:id="rId28">
+      <w:hyperlink r:id="rId29">
         <w:r>
           <w:rPr>
             <w:color w:val="173D59"/>
@@ -828,7 +860,7 @@
       <w:r>
         <w:t xml:space="preserve">Earlier experience: </w:t>
       </w:r>
-      <w:hyperlink r:id="rId29">
+      <w:hyperlink r:id="rId30">
         <w:r>
           <w:rPr>
             <w:color w:val="173D59"/>
@@ -857,7 +889,7 @@
           <w:numId w:val="10"/>
         </w:numPr>
       </w:pPr>
-      <w:hyperlink r:id="rId30">
+      <w:hyperlink r:id="rId31">
         <w:r>
           <w:rPr>
             <w:color w:val="173D59"/>
@@ -878,7 +910,7 @@
           <w:numId w:val="10"/>
         </w:numPr>
       </w:pPr>
-      <w:hyperlink r:id="rId31">
+      <w:hyperlink r:id="rId32">
         <w:r>
           <w:rPr>
             <w:color w:val="173D59"/>
@@ -899,7 +931,7 @@
           <w:numId w:val="10"/>
         </w:numPr>
       </w:pPr>
-      <w:hyperlink r:id="rId32">
+      <w:hyperlink r:id="rId33">
         <w:r>
           <w:rPr>
             <w:color w:val="173D59"/>
@@ -920,7 +952,7 @@
           <w:numId w:val="10"/>
         </w:numPr>
       </w:pPr>
-      <w:hyperlink r:id="rId33">
+      <w:hyperlink r:id="rId34">
         <w:r>
           <w:rPr>
             <w:color w:val="173D59"/>
@@ -941,7 +973,7 @@
           <w:numId w:val="10"/>
         </w:numPr>
       </w:pPr>
-      <w:hyperlink r:id="rId34">
+      <w:hyperlink r:id="rId35">
         <w:r>
           <w:rPr>
             <w:color w:val="173D59"/>
@@ -962,7 +994,7 @@
           <w:numId w:val="10"/>
         </w:numPr>
       </w:pPr>
-      <w:hyperlink r:id="rId35">
+      <w:hyperlink r:id="rId36">
         <w:r>
           <w:rPr>
             <w:color w:val="173D59"/>
@@ -1036,7 +1068,7 @@
       </w:r>
     </w:p>
     <w:sectPr>
-      <w:footerReference w:type="default" r:id="rId36"/>
+      <w:footerReference w:type="default" r:id="rId37"/>
       <w:pgSz w:w="11906" w:h="16838"/>
       <w:pgMar w:top="1020" w:right="1020" w:bottom="1020" w:left="1020" w:header="510" w:footer="510" w:gutter="0"/>
       <w:cols w:space="720"/>

</xml_diff>

<commit_message>
Clarify business consulting, project purpose and big-data architecture scope
</commit_message>
<xml_diff>
--- a/assets/Hrvoje_Jerkovic_CV_EN.docx
+++ b/assets/Hrvoje_Jerkovic_CV_EN.docx
@@ -112,10 +112,10 @@
         <w:rPr>
           <w:b/>
         </w:rPr>
-        <w:t xml:space="preserve">Data governance: </w:t>
+        <w:t xml:space="preserve">Business and data consulting: </w:t>
       </w:r>
       <w:r>
-        <w:t>Collibra, OpenMetadata, Unity Catalog, data cataloguing, metadata management, table/column lineage, data quality, access controls and auditability.</w:t>
+        <w:t>mapping complex processes and data flows, helping clients clarify needs and uncover gaps; redesigning workflows, diagnosing root causes across data pipelines and translating findings into practical improvements.</w:t>
       </w:r>
     </w:p>
     <w:p>
@@ -184,10 +184,28 @@
         <w:rPr>
           <w:b/>
         </w:rPr>
-        <w:t xml:space="preserve">Consulting and AI: </w:t>
+        <w:t xml:space="preserve">Data governance: </w:t>
       </w:r>
       <w:r>
-        <w:t>requirements discovery, architecture trade-offs, technical coordination, mentoring and workshops; AI-assisted ETL analysis and validated migration workflows.</w:t>
+        <w:t>Collibra, OpenMetadata, Unity Catalog, data cataloguing, metadata management, table/column lineage, data quality, access controls and auditability.</w:t>
+      </w:r>
+    </w:p>
+    <w:p>
+      <w:pPr>
+        <w:pStyle w:val="CVBullet"/>
+        <w:numPr>
+          <w:ilvl w:val="0"/>
+          <w:numId w:val="10"/>
+        </w:numPr>
+      </w:pPr>
+      <w:r>
+        <w:rPr>
+          <w:b/>
+        </w:rPr>
+        <w:t xml:space="preserve">Delivery and applied AI: </w:t>
+      </w:r>
+      <w:r>
+        <w:t>prototypes and demos to validate requirements and assess solution trade-offs; implementation planning, technical coordination, testing and handover; AI for automation, predictive analytics and migration; mentoring and workshops.</w:t>
       </w:r>
     </w:p>
     <w:p>
@@ -232,7 +250,7 @@
         </w:numPr>
       </w:pPr>
       <w:r>
-        <w:t>Designed and implemented a lakehouse migration framework for an Oracle/PostgreSQL estate of approximately 4,300 ETL mappings and 1,800 landing tables. Defined Bronze/Silver/Gold layers and reusable dbt models targeting Spark and Delta Lake.</w:t>
+        <w:t>Designed and implemented a banking lakehouse migration framework for an Oracle/PostgreSQL estate of approximately 4,300 ETL mappings and 1,800 landing tables. Defined Bronze/Silver/Gold layers and reusable dbt models targeting Spark and Delta Lake.</w:t>
       </w:r>
     </w:p>
     <w:p>
@@ -309,7 +327,7 @@
         </w:r>
       </w:hyperlink>
       <w:r>
-        <w:t>: led SQL/dbt model upgrades and maintenance in a Kafka-to-S3-to-Airflow-to-Snowflake pipeline handling approximately 1-5 million nested JSON records per hour. Investigated data issues using DataDog and Grafana.</w:t>
+        <w:t>: digital out-of-home advertising analytics; led SQL/dbt upgrades in a Kafka/S3/Airflow/Snowflake pipeline handling approximately 1-5 million nested JSON records per hour. Investigated data issues using DataDog and Grafana.</w:t>
       </w:r>
     </w:p>
     <w:p>
@@ -496,7 +514,7 @@
         </w:numPr>
       </w:pPr>
       <w:r>
-        <w:t>Designed architecture and development specifications for six modules of an EU-funded national transport platform, connecting business processes, domain models, APIs, identity/RBAC, audit trails and reporting.</w:t>
+        <w:t>Designed architecture and development specifications for six modules of an EU-funded national road-transport platform, connecting business processes, domain models, APIs, identity/RBAC, audit trails and reporting.</w:t>
       </w:r>
     </w:p>
     <w:p>
@@ -562,7 +580,7 @@
         </w:numPr>
       </w:pPr>
       <w:r>
-        <w:t>Built banking demonstrations, guided labs and follow-up assignments, including dbt tests, Bundles and delivery workflows. Connected practical exercises with Associate/Professional certification topics and adapted material to the team's environment.</w:t>
+        <w:t>Built banking demos, guided labs and assignments with dbt tests, Bundles and delivery workflows. Linked exercises to Associate/Professional certification topics and adapted them to the team's environment.</w:t>
       </w:r>
     </w:p>
     <w:p>
@@ -664,7 +682,7 @@
         </w:numPr>
       </w:pPr>
       <w:r>
-        <w:t>Designed an open-source lakehouse for a planned 250 TB+ scope covering 75,000+ drivers and 65,000+ vehicles. Defined 40+ safety, compliance and efficiency indicators integrating tachograph, inspection and ministry data.</w:t>
+        <w:t>Designed an open-source big-data lakehouse architecture and analytics platform sized for 250 TB+, 75,000+ drivers and 65,000+ vehicles. Defined 40+ safety, compliance and efficiency indicators integrating tachograph, inspection and ministry data.</w:t>
       </w:r>
     </w:p>
     <w:p>
@@ -677,7 +695,7 @@
         </w:numPr>
       </w:pPr>
       <w:r>
-        <w:t>Prepared infrastructure, processing and other specifications as part of the full technical documentation used for subsequent implementation, covering Spark, MinIO, dbt, Dagster, OpenMetadata and PostgreSQL.</w:t>
+        <w:t>Prepared infrastructure, processing and other specifications in the full implementation documentation: Spark, MinIO, Trino, StarRocks, dbt, Dagster, OpenMetadata, PostgreSQL, Superset and Kubernetes.</w:t>
       </w:r>
     </w:p>
     <w:p>
@@ -729,7 +747,7 @@
         </w:numPr>
       </w:pPr>
       <w:r>
-        <w:t>Developed AWS audio-processing components with S3, Lambda, EFS, PostgreSQL/RDS, SAM, CloudFormation and CodeBuild. Integrated pretrained models for genre, style, mood, instrumentation and danceability; built audio-feature extraction, metadata processing and an interactive waveform demonstration. Designed a recommendation-service architecture.</w:t>
+        <w:t>Big-data processing and analysis of audio files: developed AWS components with S3, Lambda, EFS, DynamoDB, PostgreSQL/RDS, SAM, CloudFormation and CodeBuild. Integrated pretrained models for genre, style, mood, instrumentation and danceability; built audio-feature extraction, metadata processing and an interactive waveform demo. Designed recommendation services with DynamoDB for user interactions and Redshift for analytical history.</w:t>
       </w:r>
     </w:p>
     <w:p>
@@ -775,7 +793,7 @@
         </w:r>
       </w:hyperlink>
       <w:r>
-        <w:t>: developed real-time software to compare phasor angles from PMU measurements, perform power-system calculations and trigger PLC actions for grid regulation. Used Python, Java and Kafka Streams; achieved a response below 50 ms, significantly faster than SCADA in this project.</w:t>
+        <w:t>: real-time grid regulation; developed software to compare phasor angles from PMU measurements, perform power-system calculations and trigger PLC actions. Used Python, Java and Kafka Streams; achieved a response below 50 ms, significantly faster than SCADA in this project.</w:t>
       </w:r>
     </w:p>
     <w:p>

</xml_diff>

<commit_message>
Add Elasticsearch search evaluation to CV and audio project
</commit_message>
<xml_diff>
--- a/assets/Hrvoje_Jerkovic_CV_EN.docx
+++ b/assets/Hrvoje_Jerkovic_CV_EN.docx
@@ -133,7 +133,7 @@
         <w:t xml:space="preserve">Engineering: </w:t>
       </w:r>
       <w:r>
-        <w:t>Python, SQL, dbt, Spark, Delta Lake, Airflow, Kafka, Snowflake, PostgreSQL and Oracle; batch, streaming, APIs and CDC patterns.</w:t>
+        <w:t>Python, SQL, dbt, Spark, Delta Lake, Airflow, Kafka, Snowflake, PostgreSQL, Oracle, Elasticsearch and OpenSearch; batch, streaming, APIs and CDC patterns.</w:t>
       </w:r>
     </w:p>
     <w:p>
@@ -747,7 +747,7 @@
         </w:numPr>
       </w:pPr>
       <w:r>
-        <w:t>Big-data processing and analysis of audio files: developed AWS components with S3, Lambda, EFS, DynamoDB, PostgreSQL/RDS, SAM, CloudFormation and CodeBuild. Integrated pretrained models for genre, style, mood, instrumentation and danceability; built audio-feature extraction, metadata processing and an interactive waveform demo. Designed recommendation services with DynamoDB for user interactions and Redshift for analytical history.</w:t>
+        <w:t>Big-data processing and analysis of audio files: developed AWS components with S3, Lambda, EFS, DynamoDB, PostgreSQL/RDS, SAM, CloudFormation and CodeBuild. Integrated pretrained models for genre, style, mood, instrumentation and danceability; built audio-feature extraction, metadata processing and an interactive waveform demo. Designed recommendation services with DynamoDB for user interactions and Redshift for analytical history. Evaluated Elasticsearch and OpenSearch for audio-feature and metadata search.</w:t>
       </w:r>
     </w:p>
     <w:p>

</xml_diff>

<commit_message>
Document eADR RAG and strengthen business consulting expertise
</commit_message>
<xml_diff>
--- a/assets/Hrvoje_Jerkovic_CV_EN.docx
+++ b/assets/Hrvoje_Jerkovic_CV_EN.docx
@@ -115,7 +115,7 @@
         <w:t xml:space="preserve">Business and data consulting: </w:t>
       </w:r>
       <w:r>
-        <w:t>mapping complex processes and data flows, helping clients clarify needs and uncover gaps; redesigning workflows, diagnosing root causes across data pipelines and translating findings into practical improvements.</w:t>
+        <w:t>helping clients understand complex processes and turn fragmented data into useful analytics; identifying gaps in data, infrastructure and team capabilities; resolving pipeline problems and redesigning workflows to support informed decisions and business improvements.</w:t>
       </w:r>
     </w:p>
     <w:p>
@@ -205,7 +205,7 @@
         <w:t xml:space="preserve">Delivery and applied AI: </w:t>
       </w:r>
       <w:r>
-        <w:t>prototypes and demos to validate requirements and assess solution trade-offs; implementation planning, technical coordination, testing and handover; AI for automation, predictive analytics and migration; mentoring and workshops.</w:t>
+        <w:t>prototypes and demos, implementation planning, technical coordination, testing and handover; RAG for document retrieval, local LLM evaluation, automation, predictive analytics and AI-assisted migration; mentoring and workshops.</w:t>
       </w:r>
     </w:p>
     <w:p>
@@ -527,7 +527,7 @@
         </w:numPr>
       </w:pPr>
       <w:r>
-        <w:t>Coordinated technical delivery and stakeholder decisions. Led user acceptance testing and integration checks, linked requirements to test cases, and defined API behaviour, error handling, retries and rules to prevent duplicate processing.</w:t>
+        <w:t>Led technical coordination, stakeholder decisions, user acceptance testing and requirements-to-test traceability; specified API errors, retries and duplicate-prevention rules. Built a local RAG knowledge base for architecture and development specifications, combining semantic search, BM25 and MCP.</w:t>
       </w:r>
     </w:p>
     <w:p>

</xml_diff>

<commit_message>
Add AFFINIS unified analytics case and eADR Data Architect role
</commit_message>
<xml_diff>
--- a/assets/Hrvoje_Jerkovic_CV_EN.docx
+++ b/assets/Hrvoje_Jerkovic_CV_EN.docx
@@ -31,32 +31,37 @@
         <w:pStyle w:val="CVContact"/>
       </w:pPr>
       <w:r>
-        <w:t>hrvojej@gmail.com | +385 99 480 6875</w:t>
+        <w:t xml:space="preserve">hrvojej@gmail.com | +385 99 480 6875 | </w:t>
       </w:r>
-    </w:p>
-    <w:p>
-      <w:pPr>
-        <w:pStyle w:val="CVContact"/>
-      </w:pPr>
       <w:hyperlink r:id="rId9">
         <w:r>
           <w:rPr>
             <w:color w:val="173D59"/>
             <w:u w:val="none"/>
           </w:rPr>
-          <w:t>Online CV</w:t>
+          <w:t>LinkedIn</w:t>
         </w:r>
       </w:hyperlink>
+    </w:p>
+    <w:p>
+      <w:pPr>
+        <w:pStyle w:val="CVPortfolioLabel"/>
+      </w:pPr>
       <w:r>
-        <w:t xml:space="preserve"> | </w:t>
+        <w:t>Online CV &amp; detailed project portfolio</w:t>
       </w:r>
+    </w:p>
+    <w:p>
+      <w:pPr>
+        <w:pStyle w:val="CVPortfolioLink"/>
+      </w:pPr>
       <w:hyperlink r:id="rId10">
         <w:r>
           <w:rPr>
             <w:color w:val="173D59"/>
-            <w:u w:val="none"/>
+            <w:u w:val="single"/>
           </w:rPr>
-          <w:t>LinkedIn</w:t>
+          <w:t>hrvojej.github.io/cv/</w:t>
         </w:r>
       </w:hyperlink>
     </w:p>
@@ -115,7 +120,7 @@
         <w:t xml:space="preserve">Business and data consulting: </w:t>
       </w:r>
       <w:r>
-        <w:t>helping clients understand complex processes and turn fragmented data into useful analytics; identifying gaps in data, infrastructure and team capabilities; resolving pipeline problems and redesigning workflows to support informed decisions and business improvements.</w:t>
+        <w:t>understanding business processes and data at source; tracing meaning, transformations and root causes with clients, then shaping architecture, process redesign, migrations and new services.</w:t>
       </w:r>
     </w:p>
     <w:p>
@@ -327,7 +332,7 @@
         </w:r>
       </w:hyperlink>
       <w:r>
-        <w:t>: digital out-of-home advertising analytics; led SQL/dbt upgrades in a Kafka/S3/Airflow/Snowflake pipeline handling approximately 1-5 million nested JSON records per hour. Investigated data issues using DataDog and Grafana.</w:t>
+        <w:t>: led SQL/dbt upgrades in Kafka/S3/Airflow/Snowflake advertising analytics processing 1–5 million nested JSON records/hour; investigated issues with DataDog and Grafana.</w:t>
       </w:r>
     </w:p>
     <w:p>
@@ -374,7 +379,7 @@
         </w:r>
       </w:hyperlink>
       <w:r>
-        <w:t>: integrated Google Analytics, email campaigns, Salesforce, paid advertising and social-channel data into unified marketing analytics in Snowflake using dbt, Matillion and SQL.</w:t>
+        <w:t>: unified Google Analytics, email, Salesforce, paid advertising and social data in Snowflake with dbt, Matillion and SQL.</w:t>
       </w:r>
     </w:p>
     <w:p>
@@ -399,7 +404,7 @@
         </w:r>
       </w:hyperlink>
       <w:r>
-        <w:t xml:space="preserve"> with Airflow, S3 and Redshift. Implemented file ingestion, staging-table loads and updates for advertising viewability data.</w:t>
+        <w:t xml:space="preserve"> with Airflow, S3 and Redshift: file ingestion, staging loads and updates for advertising viewability data.</w:t>
       </w:r>
     </w:p>
     <w:p>
@@ -421,7 +426,7 @@
         </w:r>
       </w:hyperlink>
       <w:r>
-        <w:t>: developed Python extraction and PostgreSQL models for Confluence documentation, structuring table, column, business and governance metadata for analysis and the wider Collibra environment.</w:t>
+        <w:t>: used Python and PostgreSQL to structure table, column, business and governance metadata from Confluence for analysis and Collibra.</w:t>
       </w:r>
     </w:p>
     <w:p>
@@ -443,7 +448,7 @@
         </w:r>
       </w:hyperlink>
       <w:r>
-        <w:t>: built and tested schema-metadata capture using SQL and PL/pgSQL, with metadata refresh after DDL changes and audit records for table and column changes.</w:t>
+        <w:t>: built and tested SQL/PL/pgSQL schema-metadata capture, refresh after DDL changes and table/column audit records.</w:t>
       </w:r>
     </w:p>
     <w:p>
@@ -465,7 +470,7 @@
         </w:r>
       </w:hyperlink>
       <w:r>
-        <w:t>: mapped telecom data models to TM Forum SID/ODA using ER/UML modelling tools, connecting business processes, database entities and attributes with the industry information model.</w:t>
+        <w:t>: mapped telecom processes, entities and attributes to TM Forum SID/ODA using ER/UML models.</w:t>
       </w:r>
     </w:p>
     <w:p>
@@ -483,7 +488,7 @@
         <w:spacing w:before="100"/>
       </w:pPr>
       <w:r>
-        <w:t>Solution Architect / Technical Lead - eADR</w:t>
+        <w:t>Solution Architect / Data Architect / Technical Lead - eADR</w:t>
       </w:r>
     </w:p>
     <w:p>
@@ -527,7 +532,29 @@
         </w:numPr>
       </w:pPr>
       <w:r>
-        <w:t>Led technical coordination, stakeholder decisions, user acceptance testing and requirements-to-test traceability; specified API errors, retries and duplicate-prevention rules. Built a local RAG knowledge base for architecture and development specifications, combining semantic search, BM25 and MCP.</w:t>
+        <w:t>Led technical coordination, stakeholder decisions and UAT with requirements-to-test traceability. Built a local RAG knowledge base for project specifications using semantic search, BM25 and MCP.</w:t>
+      </w:r>
+    </w:p>
+    <w:p>
+      <w:pPr>
+        <w:pStyle w:val="CVBullet"/>
+        <w:spacing w:after="10"/>
+        <w:numPr>
+          <w:ilvl w:val="0"/>
+          <w:numId w:val="10"/>
+        </w:numPr>
+      </w:pPr>
+      <w:hyperlink r:id="rId20">
+        <w:r>
+          <w:rPr>
+            <w:color w:val="173D59"/>
+            <w:u w:val="none"/>
+          </w:rPr>
+          <w:t>AFFINIS unified analytics</w:t>
+        </w:r>
+      </w:hyperlink>
+      <w:r>
+        <w:t>: designed the lakehouse expansion for eADR and eFTI/NSCP data; delivered data-model, pipeline and reporting specifications, analytical-validation requirements and an infrastructure-upgrade assessment.</w:t>
       </w:r>
     </w:p>
     <w:p>
@@ -544,7 +571,7 @@
         <w:pStyle w:val="CVMetadata"/>
         <w:spacing w:after="40"/>
       </w:pPr>
-      <w:hyperlink r:id="rId20">
+      <w:hyperlink r:id="rId21">
         <w:r>
           <w:rPr>
             <w:color w:val="173D59"/>
@@ -597,7 +624,7 @@
         <w:pStyle w:val="CVMetadata"/>
         <w:spacing w:after="40"/>
       </w:pPr>
-      <w:hyperlink r:id="rId21">
+      <w:hyperlink r:id="rId22">
         <w:r>
           <w:rPr>
             <w:color w:val="173D59"/>
@@ -650,7 +677,7 @@
         <w:pStyle w:val="CVMetadata"/>
         <w:spacing w:after="40"/>
       </w:pPr>
-      <w:hyperlink r:id="rId22">
+      <w:hyperlink r:id="rId23">
         <w:r>
           <w:rPr>
             <w:color w:val="173D59"/>
@@ -662,7 +689,7 @@
       <w:r>
         <w:t xml:space="preserve"> | Jul - Dec 2024 | </w:t>
       </w:r>
-      <w:hyperlink r:id="rId23">
+      <w:hyperlink r:id="rId24">
         <w:r>
           <w:rPr>
             <w:color w:val="173D59"/>
@@ -725,7 +752,7 @@
       <w:pPr>
         <w:pStyle w:val="CVMetadata"/>
       </w:pPr>
-      <w:hyperlink r:id="rId24">
+      <w:hyperlink r:id="rId25">
         <w:r>
           <w:rPr>
             <w:color w:val="173D59"/>
@@ -762,7 +789,7 @@
       <w:pPr>
         <w:pStyle w:val="CVMetadata"/>
       </w:pPr>
-      <w:hyperlink r:id="rId25">
+      <w:hyperlink r:id="rId26">
         <w:r>
           <w:rPr>
             <w:color w:val="173D59"/>
@@ -783,7 +810,7 @@
           <w:numId w:val="10"/>
         </w:numPr>
       </w:pPr>
-      <w:hyperlink r:id="rId26">
+      <w:hyperlink r:id="rId27">
         <w:r>
           <w:rPr>
             <w:color w:val="173D59"/>
@@ -804,7 +831,7 @@
           <w:numId w:val="10"/>
         </w:numPr>
       </w:pPr>
-      <w:hyperlink r:id="rId27">
+      <w:hyperlink r:id="rId28">
         <w:r>
           <w:rPr>
             <w:color w:val="173D59"/>
@@ -825,7 +852,7 @@
           <w:numId w:val="10"/>
         </w:numPr>
       </w:pPr>
-      <w:hyperlink r:id="rId28">
+      <w:hyperlink r:id="rId29">
         <w:r>
           <w:rPr>
             <w:color w:val="173D59"/>
@@ -846,7 +873,7 @@
           <w:numId w:val="10"/>
         </w:numPr>
       </w:pPr>
-      <w:hyperlink r:id="rId29">
+      <w:hyperlink r:id="rId30">
         <w:r>
           <w:rPr>
             <w:color w:val="173D59"/>
@@ -878,7 +905,7 @@
       <w:r>
         <w:t xml:space="preserve">Earlier experience: </w:t>
       </w:r>
-      <w:hyperlink r:id="rId30">
+      <w:hyperlink r:id="rId31">
         <w:r>
           <w:rPr>
             <w:color w:val="173D59"/>
@@ -907,7 +934,7 @@
           <w:numId w:val="10"/>
         </w:numPr>
       </w:pPr>
-      <w:hyperlink r:id="rId31">
+      <w:hyperlink r:id="rId32">
         <w:r>
           <w:rPr>
             <w:color w:val="173D59"/>
@@ -928,7 +955,7 @@
           <w:numId w:val="10"/>
         </w:numPr>
       </w:pPr>
-      <w:hyperlink r:id="rId32">
+      <w:hyperlink r:id="rId33">
         <w:r>
           <w:rPr>
             <w:color w:val="173D59"/>
@@ -949,7 +976,7 @@
           <w:numId w:val="10"/>
         </w:numPr>
       </w:pPr>
-      <w:hyperlink r:id="rId33">
+      <w:hyperlink r:id="rId34">
         <w:r>
           <w:rPr>
             <w:color w:val="173D59"/>
@@ -970,7 +997,7 @@
           <w:numId w:val="10"/>
         </w:numPr>
       </w:pPr>
-      <w:hyperlink r:id="rId34">
+      <w:hyperlink r:id="rId35">
         <w:r>
           <w:rPr>
             <w:color w:val="173D59"/>
@@ -991,7 +1018,7 @@
           <w:numId w:val="10"/>
         </w:numPr>
       </w:pPr>
-      <w:hyperlink r:id="rId35">
+      <w:hyperlink r:id="rId36">
         <w:r>
           <w:rPr>
             <w:color w:val="173D59"/>
@@ -1012,7 +1039,7 @@
           <w:numId w:val="10"/>
         </w:numPr>
       </w:pPr>
-      <w:hyperlink r:id="rId36">
+      <w:hyperlink r:id="rId37">
         <w:r>
           <w:rPr>
             <w:color w:val="173D59"/>
@@ -1086,7 +1113,7 @@
       </w:r>
     </w:p>
     <w:sectPr>
-      <w:footerReference w:type="default" r:id="rId37"/>
+      <w:footerReference w:type="default" r:id="rId38"/>
       <w:pgSz w:w="11906" w:h="16838"/>
       <w:pgMar w:top="1020" w:right="1020" w:bottom="1020" w:left="1020" w:header="510" w:footer="510" w:gutter="0"/>
       <w:cols w:space="720"/>
@@ -13232,6 +13259,40 @@
       <w:i w:val="0"/>
       <w:color w:val="53616D"/>
       <w:sz w:val="19"/>
+      <w:lang w:val="en-GB"/>
+    </w:rPr>
+  </w:style>
+  <w:style w:type="paragraph" w:customStyle="1" w:styleId="CVPortfolioLabel">
+    <w:name w:val="CV Portfolio Label"/>
+    <w:pPr>
+      <w:keepNext/>
+      <w:keepLines/>
+      <w:widowControl/>
+      <w:spacing w:before="100" w:after="0" w:line="259" w:lineRule="auto"/>
+    </w:pPr>
+    <w:rPr>
+      <w:rFonts w:ascii="Calibri" w:hAnsi="Calibri"/>
+      <w:b/>
+      <w:i w:val="0"/>
+      <w:color w:val="173D59"/>
+      <w:sz w:val="22"/>
+      <w:lang w:val="en-GB"/>
+    </w:rPr>
+  </w:style>
+  <w:style w:type="paragraph" w:customStyle="1" w:styleId="CVPortfolioLink">
+    <w:name w:val="CV Portfolio Link"/>
+    <w:pPr>
+      <w:keepNext/>
+      <w:keepLines/>
+      <w:widowControl/>
+      <w:spacing w:before="0" w:after="40" w:line="259" w:lineRule="auto"/>
+    </w:pPr>
+    <w:rPr>
+      <w:rFonts w:ascii="Calibri" w:hAnsi="Calibri"/>
+      <w:b w:val="0"/>
+      <w:i w:val="0"/>
+      <w:color w:val="173D59"/>
+      <w:sz w:val="22"/>
       <w:lang w:val="en-GB"/>
     </w:rPr>
   </w:style>

</xml_diff>

<commit_message>
Add confirmed ETL and NoSQL experience to CV and projects
</commit_message>
<xml_diff>
--- a/assets/Hrvoje_Jerkovic_CV_EN.docx
+++ b/assets/Hrvoje_Jerkovic_CV_EN.docx
@@ -138,7 +138,25 @@
         <w:t xml:space="preserve">Engineering: </w:t>
       </w:r>
       <w:r>
-        <w:t>Python, SQL, dbt, Spark, Delta Lake, Airflow, Kafka, Snowflake, PostgreSQL, Oracle, Elasticsearch and OpenSearch; batch, streaming, APIs and CDC patterns.</w:t>
+        <w:t>Python, SQL, dbt, Spark, Delta Lake, Airflow, Kafka, Snowflake, PostgreSQL, Oracle, Elasticsearch and OpenSearch; batch, streaming, APIs and CDC patterns. NoSQL: Amazon DynamoDB and MongoDB.</w:t>
+      </w:r>
+    </w:p>
+    <w:p>
+      <w:pPr>
+        <w:pStyle w:val="CVBullet"/>
+        <w:numPr>
+          <w:ilvl w:val="0"/>
+          <w:numId w:val="10"/>
+        </w:numPr>
+      </w:pPr>
+      <w:r>
+        <w:rPr>
+          <w:b/>
+        </w:rPr>
+        <w:t xml:space="preserve">ETL/ELT and ingestion: </w:t>
+      </w:r>
+      <w:r>
+        <w:t>Matillion, Oracle Data Integrator (ODI), Fivetran; serverless pipelines with AWS Lambda, AWS Step Functions and AWS Glue.</w:t>
       </w:r>
     </w:p>
     <w:p>
@@ -267,7 +285,7 @@
         </w:numPr>
       </w:pPr>
       <w:r>
-        <w:t>Developed automated reverse engineering of ODI, DataStage and PL/SQL flows, reconstructing table- and column-level lineage across more than 20 source systems. Produced dependency graphs, SQL traceability and structured metadata for downstream automation.</w:t>
+        <w:t>Used Oracle Data Integrator (ODI) extensively in RBA reengineering. Automated analysis of ODI, DataStage and PL/SQL flows to reconstruct table/column lineage across 20+ source systems, with dependency graphs and structured metadata.</w:t>
       </w:r>
     </w:p>
     <w:p>
@@ -379,7 +397,7 @@
         </w:r>
       </w:hyperlink>
       <w:r>
-        <w:t>: unified Google Analytics, email, Salesforce, paid advertising and social data in Snowflake with dbt, Matillion and SQL.</w:t>
+        <w:t>: used Matillion to ingest data from Google Analytics, email, Salesforce, advertising and social sources; unified analytics in Snowflake with dbt and SQL.</w:t>
       </w:r>
     </w:p>
     <w:p>
@@ -404,7 +422,7 @@
         </w:r>
       </w:hyperlink>
       <w:r>
-        <w:t xml:space="preserve"> with Airflow, S3 and Redshift: file ingestion, staging loads and updates for advertising viewability data.</w:t>
+        <w:t xml:space="preserve"> using Fivetran for ingestion and initial transformations, plus Airflow, S3 and Redshift for file loads, staging and viewability updates.</w:t>
       </w:r>
     </w:p>
     <w:p>
@@ -774,7 +792,7 @@
         </w:numPr>
       </w:pPr>
       <w:r>
-        <w:t>Big-data processing and analysis of audio files: developed AWS components with S3, Lambda, EFS, DynamoDB, PostgreSQL/RDS, SAM, CloudFormation and CodeBuild. Integrated pretrained models for genre, style, mood, instrumentation and danceability; built audio-feature extraction, metadata processing and an interactive waveform demo. Designed recommendation services with DynamoDB for user interactions and Redshift for analytical history. Evaluated Elasticsearch and OpenSearch for audio-feature and metadata search.</w:t>
+        <w:t>Big-data processing and analysis of audio files: developed AWS components using S3, Lambda, EFS, Amazon DynamoDB (NoSQL), PostgreSQL/RDS, SAM, CloudFormation and CodeBuild. Integrated pretrained models for genre, style, mood, instrumentation and danceability; built feature extraction, metadata processing and a waveform demo. Designed recommendation services with DynamoDB for user interactions and Redshift for analytical history. Evaluated Elasticsearch and OpenSearch for audio-feature and metadata search.</w:t>
       </w:r>
     </w:p>
     <w:p>

</xml_diff>